<commit_message>
docs(m1): record approved concept scope and final archive gate
</commit_message>
<xml_diff>
--- a/reports/M1_report.docx
+++ b/reports/M1_report.docx
@@ -33,7 +33,7 @@
         <w:rPr>
           <w:rFonts w:hint="eastAsia"/>
         </w:rPr>
-        <w:t xml:space="preserve">概念数值关卡通过待审</w:t>
+        <w:t xml:space="preserve">概念数值范围已验收</w:t>
       </w:r>
       <w:r>
         <w:t xml:space="preserve"> · </w:t>
@@ -205,13 +205,13 @@
           <w:b/>
           <w:bCs/>
         </w:rPr>
-        <w:t xml:space="preserve">概念数值热源关卡通过、待研究者审查</w:t>
+        <w:t xml:space="preserve">概念数值热源关卡已获研究者限定验收</w:t>
       </w:r>
       <w:r>
         <w:rPr>
           <w:rFonts w:hint="eastAsia"/>
         </w:rPr>
-        <w:t xml:space="preserve">。数值通过不代表实际内部损耗、减速器图、盘片热分配或BMS边界已验证。原始绕组字段保持NaN，基线真实参数中的null不变；独立工程目录提供明确标记的铜/铁/转子其他/逆变器及减速器分项候选和条件上下界。没有建立温度求解、热网络、CAD、ANSYS、Fluent或优化模型，M2尚未授权。</w:t>
+        <w:t xml:space="preserve">。数值通过不代表实际内部损耗、减速器图、盘片热分配或BMS边界已验证。原始绕组字段保持NaN，基线真实参数中的null不变；独立工程目录提供明确标记的铜/铁/转子其他/逆变器及减速器分项候选和条件上下界。没有建立温度求解、热网络、CAD、ANSYS、Fluent或优化模型，当前M1未执行M2。</w:t>
       </w:r>
     </w:p>
     <w:p>
@@ -329,7 +329,7 @@
         <w:rPr>
           <w:rFonts w:hint="eastAsia"/>
         </w:rPr>
-        <w:t xml:space="preserve">。合并、创建正式Tag及进入M2均须用户另行批准。</w:t>
+        <w:t xml:space="preserve">。本轮用户已批准限定验收、合并及Tag归档，并授权归档成功后启动M2；见M1_GATE_ACCEPTANCE_2026-10-19.md。</w:t>
       </w:r>
     </w:p>
     <w:bookmarkEnd w:id="19"/>
@@ -11046,7 +11046,7 @@
         <w:rPr>
           <w:rFonts w:hint="eastAsia"/>
         </w:rPr>
-        <w:t xml:space="preserve">：模型守恒、无重复计热、单侧接口明确、严格与工程路径分离、参数与不确定性可追溯，实际运行证据齐备。真实标定仍为PARTIAL，不能宣称物理验证完成；是否验收由研究者决定。</w:t>
+        <w:t xml:space="preserve">：模型守恒、无重复计热、单侧接口明确、严格与工程路径分离、参数与不确定性可追溯，实际运行证据齐备。真实标定仍为PARTIAL，不能宣称物理验证完成。研究者已按概念数值模型范围验收，授权详见本轮关卡记录。</w:t>
       </w:r>
     </w:p>
     <w:p>
@@ -11065,7 +11065,7 @@
         <w:rPr>
           <w:rFonts w:hint="eastAsia"/>
         </w:rPr>
-        <w:t xml:space="preserve">，前提是参数化未知热容、热阻、冷却与合并项节点，并在守恒场景下比较敏感性；还需考察总损耗、方向效率和遗漏空载拖曳的影响。不能据此承诺真实温度精度、热安全或连续能力。本轮M2未开始，PR未合并，M1正式Tag未创建。</w:t>
+        <w:t xml:space="preserve">，前提是参数化未知热容、热阻、冷却与合并项节点，并在守恒场景下比较敏感性；还需考察总损耗、方向效率和遗漏空载拖曳的影响。不能据此承诺真实温度精度、热安全或连续能力。M1计算未包含M2；研究者已授权归档成功后启动M2，实际合并及Tag目标另行登记。</w:t>
       </w:r>
     </w:p>
     <w:bookmarkEnd w:id="60"/>

</xml_diff>